<commit_message>
feat(settings): tách Điểm thưởng thành subtab riêng — bản 4.1.2
Bảng điểm thưởng trước nằm cuối tab Quy định, admin phải cuộn qua công thức
tính điểm và quy định nhập liệu mới thấy. Đây là bảng phải mở lại nhiều lần
mỗi mùa phong trào nên cho ra ngoài thành subtab riêng.

- Tab mới "Điểm thưởng" (icon cúp), đặt ngay sau Quy định
- Bảng điểm để lên đầu tab, ba danh mục dựng nên nó (Giải thưởng, Cấp độ,
  Nhóm hoạt động) xuống dưới — trước đây thứ tự ngược lại
- Chưa khai giải hoặc cấp độ thì thay bảng rỗng bằng lời nhắc thêm danh mục
- Tab Quy định giờ chỉ còn công thức điểm, quy định nhập liệu, khối lớp, tông màu

ListEditor tách khỏi SettingsRulesTab ra file riêng vì cả hai tab đều dùng.
Kiểm tra "phải có ít nhất một giải thưởng" chuyển sang tab Điểm thưởng — để ở
tab Quy định thì admin bị chặn lưu mà không sửa được ngay tại đó.

Tài liệu hướng dẫn cập nhật đường đi mới tới bảng điểm.

Co-Authored-By: Claude Opus 5 (1M context) <noreply@anthropic.com>
</commit_message>
<xml_diff>
--- a/HuongDan_SuDung_NenNep.docx
+++ b/HuongDan_SuDung_NenNep.docx
@@ -94,7 +94,7 @@
           <w:sz w:val="24"/>
           <w:szCs w:val="24"/>
         </w:rPr>
-        <w:t xml:space="preserve">Phiên bản chuyên nghiệp 4.1.1 — Công nghệ Đồng bộ Đám mây</w:t>
+        <w:t xml:space="preserve">Phiên bản chuyên nghiệp 4.1.2 — Công nghệ Đồng bộ Đám mây</w:t>
       </w:r>
     </w:p>
     <w:p>
@@ -4998,7 +4998,7 @@
           <w:sz w:val="28"/>
           <w:szCs w:val="28"/>
         </w:rPr>
-        <w:t xml:space="preserve">Bước 6: Thiết lập Quy định chung &amp; Bảng điểm khen thưởng</w:t>
+        <w:t xml:space="preserve">Bước 6: Thiết lập Quy định chung &amp; Bảng điểm thưởng</w:t>
       </w:r>
     </w:p>
     <w:p>
@@ -5133,7 +5133,7 @@
           <w:sz w:val="26"/>
           <w:szCs w:val="26"/>
         </w:rPr>
-        <w:t xml:space="preserve">Bảng điểm khen thưởng: Nhập ma trận điểm cho các Giải (Nhất, Nhì, Ba, Khuyến khích) tương ứng với từng Cấp độ (Cấp Trường, Cấp Huyện/TP, Cấp Tỉnh, Cấp Quốc gia).</w:t>
+        <w:t xml:space="preserve">Chuyển sang tab Cấu hình → Điểm thưởng: Nhập ma trận điểm cho các Giải (Nhất, Nhì, Ba, Khuyến khích) tương ứng với từng Cấp độ (Cấp Trường, Cấp Huyện/TP, Cấp Tỉnh, Cấp Quốc gia). Ba danh mục Giải thưởng, Cấp độ và Nhóm hoạt động cũng khai ngay tại tab này.</w:t>
       </w:r>
     </w:p>
     <w:p>
@@ -5687,7 +5687,7 @@
           <w:sz w:val="26"/>
           <w:szCs w:val="26"/>
         </w:rPr>
-        <w:t xml:space="preserve">Ở bảng danh sách lớp đạt giải bên dưới: Bấm "Thêm dòng", chọn Lớp và chọn Giải thưởng (Nhất/Nhì/Ba/Khuyến khích). Số điểm chuẩn (viền xanh) sẽ tự động hiển thị từ ma trận quy định.</w:t>
+        <w:t xml:space="preserve">Ở bảng danh sách lớp đạt giải bên dưới: Bấm "Thêm dòng", chọn Lớp và chọn Giải thưởng (Nhất/Nhì/Ba/Khuyến khích). Số điểm chuẩn (viền xanh) sẽ tự động hiển thị từ ma trận đã khai ở tab Cấu hình → Điểm thưởng.</w:t>
       </w:r>
     </w:p>
     <w:p>

</xml_diff>